<commit_message>
Add site plan import, Word output, company stamp; drop reference number
- New project can start from the Land Site Plan PDF: pdf.js reads it in the
  browser (never uploaded) and the parser fills city, area, sector, plot
  number, land use and owner names (AR/EN) after a review dialog.
- Generate dialog: choose PDF or Word (.docx) and whether to add the ACAD
  stamp. Word output fills the sanitized DOCX in place; official PDF forms
  stay PDF. History shows the file format.
- Company stamp (no signature) placed on the consultant area of letters,
  commitments and forms when selected.
- Remove the separate reference number field (the plot number is the
  reference); trim the top spacing of the Word letters (template v2).
- Migration 20261014000100 allows .docx in generated-documents.

Co-Authored-By: Claude Opus 5.5 <noreply@anthropic.com>
Claude-Session: https://claude.ai/code/session_01KhB95Q3CdNoHoGHNq4XQ7x
</commit_message>
<xml_diff>
--- a/templates/sanitized/archive-drawings-explanation.docx
+++ b/templates/sanitized/archive-drawings-explanation.docx
@@ -1039,6 +1039,17 @@
           <w:lang w:bidi="ar-AE"/>
         </w:rPr>
         <w:t>الاستشاري</w:t>
+      </w:r>
+      <w:r>
+        <w:rPr>
+          <w:rFonts w:cs="Times New Roman" w:ascii="Times New Roman" w:hAnsi="Times New Roman" w:eastAsia="Times New Roman"/>
+          <w:szCs w:val="24"/>
+          <w:rtl/>
+          <w:lang w:bidi="ar-AE"/>
+          <w:sz w:val="24"/>
+          <w:color w:val="FFFFFF"/>
+        </w:rPr>
+        <w:t xml:space="preserve"> </w:t>
       </w:r>
     </w:p>
     <w:p>

</xml_diff>